<commit_message>
Finalize mobile UX and project evidence package
</commit_message>
<xml_diff>
--- a/docs/deliverables/Emdadyar_Mobile_App_For_Professor.docx
+++ b/docs/deliverables/Emdadyar_Mobile_App_For_Professor.docx
@@ -15,7 +15,7 @@
           <w:color w:val="063B4A"/>
           <w:sz w:val="40"/>
         </w:rPr>
-        <w:t>نسخه موبایلی قابل نصب «امداد یار»</w:t>
+        <w:t>نسخه نهایی موبایل و وب‌اپ «امداد یار»</w:t>
       </w:r>
     </w:p>
     <w:p>
@@ -424,6 +424,52 @@
                 <w:b w:val="0"/>
                 <w:sz w:val="20"/>
               </w:rPr>
+              <w:t>راهنمای سه‌مرحله‌ای داخل برنامه</w:t>
+            </w:r>
+          </w:p>
+        </w:tc>
+        <w:tc>
+          <w:tcPr>
+            <w:tcW w:type="dxa" w:w="4896"/>
+            <w:vAlign w:val="center"/>
+            <w:shd w:fill="FFFFFF"/>
+          </w:tcPr>
+          <w:p>
+            <w:pPr>
+              <w:jc w:val="right"/>
+              <w:bidi/>
+            </w:pPr>
+            <w:r/>
+            <w:r>
+              <w:rPr>
+                <w:rFonts w:ascii="Arial" w:hAnsi="Arial" w:cs="Arial"/>
+                <w:b/>
+                <w:sz w:val="20"/>
+              </w:rPr>
+              <w:t>آماده</w:t>
+            </w:r>
+          </w:p>
+        </w:tc>
+      </w:tr>
+      <w:tr>
+        <w:tc>
+          <w:tcPr>
+            <w:tcW w:type="dxa" w:w="4464"/>
+            <w:vAlign w:val="center"/>
+            <w:shd w:fill="F7FBFC"/>
+          </w:tcPr>
+          <w:p>
+            <w:pPr>
+              <w:jc w:val="right"/>
+              <w:bidi/>
+            </w:pPr>
+            <w:r/>
+            <w:r>
+              <w:rPr>
+                <w:rFonts w:ascii="Arial" w:hAnsi="Arial" w:cs="Arial"/>
+                <w:b w:val="0"/>
+                <w:sz w:val="20"/>
+              </w:rPr>
               <w:t>نصب به‌صورت PWA</w:t>
             </w:r>
           </w:p>
@@ -649,7 +695,7 @@
           <w:b w:val="0"/>
           <w:sz w:val="20"/>
         </w:rPr>
-        <w:t>برای نمایش خروجی، چند داده حیاتی بیمار را وارد کنید و دکمه «ارزیابی بیمار» را بزنید. حتی با چند ورودی محدود نیز سامانه یک ارزیابی اولیه ارائه می‌دهد و میزان کامل بودن اطلاعات را جداگانه نمایش می‌دهد.</w:t>
+        <w:t>برای نمایش خروجی، چند داده حیاتی بیمار را وارد کنید و دکمه «ارزیابی» را بزنید. تب «راهنما» مسیر کار را در سه گام کوتاه نشان می‌دهد. حتی با چند ورودی محدود نیز سامانه یک ارزیابی اولیه ارائه می‌دهد و میزان کامل بودن اطلاعات را جداگانه نمایش می‌دهد.</w:t>
       </w:r>
     </w:p>
     <w:p>
@@ -713,7 +759,7 @@
           <w:sz w:val="22"/>
           <w:rtl/>
         </w:rPr>
-        <w:t>SHA-256 فایل APK: AB18DA12535748BFFA8BD02D77D2B524E42154B0C9B258C9787F0E9B54EBE4D6.</w:t>
+        <w:t>SHA-256 فایل APK: 1E4FC0C64CB79EA561F9E069D37841759A5E34806734A119A1F1E350FB38FE7E.</w:t>
       </w:r>
     </w:p>
     <w:p>
@@ -761,7 +807,7 @@
           <w:sz w:val="22"/>
           <w:rtl/>
         </w:rPr>
-        <w:t>امضا و دارایی‌های داخلی تأیید شده‌اند؛ نصب روی یک گوشی فیزیکی همچنان باید پیش از انتشار عمومی ثبت شود.</w:t>
+        <w:t>امضا و دارایی‌های داخلی تأیید شده‌اند؛ نسخه قبلی روی گوشی Samsung مشاهده شده و نصب artifact نهایی همچنان باید پیش از انتشار عمومی ثبت شود.</w:t>
       </w:r>
     </w:p>
     <w:sectPr>

</xml_diff>